<commit_message>
Q1 report v5: fix Lex Asea attribution (Athanase Innovation) + table overflow
Correct the value-creation row to attribute the tax-free Lex Asea spin-off to
Athanase Innovation (not Tempest), noting the ~NOK 143m realised from the
Zalaris exit. Fix table overflow: fixed tblLayout with explicit width sized to
the 6.9in usable page (2.3in + 4.5in cols), cantSplit on rows so they don't
break across pages, repeating header row, keep-with-next on sub-headings.

https://claude.ai/code/session_01HQUpw4QYvApiNnSfGrjnJ2
</commit_message>
<xml_diff>
--- a/Athanase_AIP_FII_Q1_2026_v5.docx
+++ b/Athanase_AIP_FII_Q1_2026_v5.docx
@@ -2093,10 +2093,14 @@
       </w:r>
     </w:p>
     <w:p>
+      <w:pPr>
+        <w:keepNext/>
+      </w:pPr>
       <w:r>
         <w:rPr>
           <w:rFonts w:ascii="Times New Roman" w:hAnsi="Times New Roman"/>
           <w:b/>
+          <w:i w:val="0"/>
           <w:color w:val="152130"/>
           <w:sz w:val="30"/>
         </w:rPr>
@@ -2107,16 +2111,21 @@
       <w:r>
         <w:rPr>
           <w:b w:val="0"/>
+          <w:i w:val="0"/>
           <w:sz w:val="21"/>
         </w:rPr>
         <w:t>Each standing claim in our investment- and risk-process is mapped below to what we actually did this quarter. The supporting detail sits in the holdings and tables that follow — so our claims can be checked against our actions.</w:t>
       </w:r>
     </w:p>
     <w:p>
+      <w:pPr>
+        <w:keepNext/>
+      </w:pPr>
       <w:r>
         <w:rPr>
           <w:rFonts w:ascii="Times New Roman" w:hAnsi="Times New Roman"/>
           <w:b/>
+          <w:i w:val="0"/>
           <w:color w:val="152130"/>
           <w:sz w:val="24"/>
         </w:rPr>
@@ -2129,20 +2138,30 @@
         <w:tblW w:type="auto" w:w="0"/>
         <w:tblLayout w:type="fixed"/>
         <w:tblLook w:firstColumn="1" w:firstRow="1" w:lastColumn="0" w:lastRow="0" w:noHBand="0" w:noVBand="1" w:val="04A0"/>
+        <w:tblLayout w:type="fixed"/>
+        <w:tblW w:type="dxa" w:w="9792"/>
       </w:tblPr>
       <w:tblGrid>
-        <w:gridCol w:w="3600"/>
-        <w:gridCol w:w="5760"/>
+        <w:gridCol w:w="3312"/>
+        <w:gridCol w:w="6480"/>
       </w:tblGrid>
       <w:tr>
-        <w:tc>
-          <w:tcPr>
-            <w:tcW w:type="dxa" w:w="3600"/>
-          </w:tcPr>
-          <w:p>
+        <w:trPr>
+          <w:cantSplit/>
+          <w:tblHeader/>
+        </w:trPr>
+        <w:tc>
+          <w:tcPr>
+            <w:tcW w:type="dxa" w:w="3312"/>
+          </w:tcPr>
+          <w:p>
+            <w:pPr>
+              <w:spacing w:after="40"/>
+            </w:pPr>
             <w:r>
               <w:rPr>
                 <w:b/>
+                <w:i w:val="0"/>
                 <w:color w:val="314359"/>
                 <w:sz w:val="18"/>
               </w:rPr>
@@ -2152,12 +2171,16 @@
         </w:tc>
         <w:tc>
           <w:tcPr>
-            <w:tcW w:type="dxa" w:w="5760"/>
-          </w:tcPr>
-          <w:p>
+            <w:tcW w:type="dxa" w:w="6480"/>
+          </w:tcPr>
+          <w:p>
+            <w:pPr>
+              <w:spacing w:after="40"/>
+            </w:pPr>
             <w:r>
               <w:rPr>
                 <w:b/>
+                <w:i w:val="0"/>
                 <w:color w:val="314359"/>
                 <w:sz w:val="18"/>
               </w:rPr>
@@ -2167,14 +2190,21 @@
         </w:tc>
       </w:tr>
       <w:tr>
-        <w:tc>
-          <w:tcPr>
-            <w:tcW w:type="dxa" w:w="3600"/>
-          </w:tcPr>
-          <w:p>
+        <w:trPr>
+          <w:cantSplit/>
+        </w:trPr>
+        <w:tc>
+          <w:tcPr>
+            <w:tcW w:type="dxa" w:w="3312"/>
+          </w:tcPr>
+          <w:p>
+            <w:pPr>
+              <w:spacing w:after="40"/>
+            </w:pPr>
             <w:r>
               <w:rPr>
                 <w:b/>
+                <w:i w:val="0"/>
                 <w:color w:val="152130"/>
                 <w:sz w:val="20"/>
               </w:rPr>
@@ -2184,12 +2214,16 @@
         </w:tc>
         <w:tc>
           <w:tcPr>
-            <w:tcW w:type="dxa" w:w="5760"/>
-          </w:tcPr>
-          <w:p>
+            <w:tcW w:type="dxa" w:w="6480"/>
+          </w:tcPr>
+          <w:p>
+            <w:pPr>
+              <w:spacing w:after="40"/>
+            </w:pPr>
             <w:r>
               <w:rPr>
                 <w:b w:val="0"/>
+                <w:i w:val="0"/>
                 <w:sz w:val="19"/>
               </w:rPr>
               <w:t>Held ~6.9% cash and flagged difficulty finding value; we are sourcing in the UK and Japan rather than chase an expensive market.</w:t>
@@ -2198,14 +2232,21 @@
         </w:tc>
       </w:tr>
       <w:tr>
-        <w:tc>
-          <w:tcPr>
-            <w:tcW w:type="dxa" w:w="3600"/>
-          </w:tcPr>
-          <w:p>
+        <w:trPr>
+          <w:cantSplit/>
+        </w:trPr>
+        <w:tc>
+          <w:tcPr>
+            <w:tcW w:type="dxa" w:w="3312"/>
+          </w:tcPr>
+          <w:p>
+            <w:pPr>
+              <w:spacing w:after="40"/>
+            </w:pPr>
             <w:r>
               <w:rPr>
                 <w:b/>
+                <w:i w:val="0"/>
                 <w:color w:val="152130"/>
                 <w:sz w:val="20"/>
               </w:rPr>
@@ -2215,12 +2256,16 @@
         </w:tc>
         <w:tc>
           <w:tcPr>
-            <w:tcW w:type="dxa" w:w="5760"/>
-          </w:tcPr>
-          <w:p>
+            <w:tcW w:type="dxa" w:w="6480"/>
+          </w:tcPr>
+          <w:p>
+            <w:pPr>
+              <w:spacing w:after="40"/>
+            </w:pPr>
             <w:r>
               <w:rPr>
                 <w:b w:val="0"/>
+                <w:i w:val="0"/>
                 <w:sz w:val="19"/>
               </w:rPr>
               <w:t>Core holdings are dominant franchises bought on value — Auto Trader (~10× its nearest rival), Rightmove (~80% of portal time), Somero (~80% global share) at a cyclical low, TBK on ~2× normalised earnings.</w:t>
@@ -2229,14 +2274,21 @@
         </w:tc>
       </w:tr>
       <w:tr>
-        <w:tc>
-          <w:tcPr>
-            <w:tcW w:type="dxa" w:w="3600"/>
-          </w:tcPr>
-          <w:p>
+        <w:trPr>
+          <w:cantSplit/>
+        </w:trPr>
+        <w:tc>
+          <w:tcPr>
+            <w:tcW w:type="dxa" w:w="3312"/>
+          </w:tcPr>
+          <w:p>
+            <w:pPr>
+              <w:spacing w:after="40"/>
+            </w:pPr>
             <w:r>
               <w:rPr>
                 <w:b/>
+                <w:i w:val="0"/>
                 <w:color w:val="152130"/>
                 <w:sz w:val="20"/>
               </w:rPr>
@@ -2246,12 +2298,16 @@
         </w:tc>
         <w:tc>
           <w:tcPr>
-            <w:tcW w:type="dxa" w:w="5760"/>
-          </w:tcPr>
-          <w:p>
+            <w:tcW w:type="dxa" w:w="6480"/>
+          </w:tcPr>
+          <w:p>
+            <w:pPr>
+              <w:spacing w:after="40"/>
+            </w:pPr>
             <w:r>
               <w:rPr>
                 <w:b w:val="0"/>
+                <w:i w:val="0"/>
                 <w:sz w:val="19"/>
               </w:rPr>
               <w:t>Tendered Zalaris into Norvestor’s NOK 100 cash offer (+37% on the day) — sold on a fair-value trigger, on the facts, not sentiment.</w:t>
@@ -2260,14 +2316,21 @@
         </w:tc>
       </w:tr>
       <w:tr>
-        <w:tc>
-          <w:tcPr>
-            <w:tcW w:type="dxa" w:w="3600"/>
-          </w:tcPr>
-          <w:p>
+        <w:trPr>
+          <w:cantSplit/>
+        </w:trPr>
+        <w:tc>
+          <w:tcPr>
+            <w:tcW w:type="dxa" w:w="3312"/>
+          </w:tcPr>
+          <w:p>
+            <w:pPr>
+              <w:spacing w:after="40"/>
+            </w:pPr>
             <w:r>
               <w:rPr>
                 <w:b/>
+                <w:i w:val="0"/>
                 <w:color w:val="152130"/>
                 <w:sz w:val="20"/>
               </w:rPr>
@@ -2277,28 +2340,39 @@
         </w:tc>
         <w:tc>
           <w:tcPr>
-            <w:tcW w:type="dxa" w:w="5760"/>
-          </w:tcPr>
-          <w:p>
+            <w:tcW w:type="dxa" w:w="6480"/>
+          </w:tcPr>
+          <w:p>
+            <w:pPr>
+              <w:spacing w:after="40"/>
+            </w:pPr>
             <w:r>
               <w:rPr>
                 <w:b w:val="0"/>
+                <w:i w:val="0"/>
                 <w:sz w:val="19"/>
               </w:rPr>
-              <w:t>Tempest: progressing a Lex Asea spin-off and a buyback / redemption of cash. TBK: pursuing the operational plan to lift margins toward 10%.</w:t>
+              <w:t>Athanase Innovation: progressing a tax-free Lex Asea spin-off to unlock value, having realised ~NOK 143m of cash from the Zalaris exit. TBK: pursuing the operational plan to lift margins toward 10%.</w:t>
             </w:r>
           </w:p>
         </w:tc>
       </w:tr>
       <w:tr>
-        <w:tc>
-          <w:tcPr>
-            <w:tcW w:type="dxa" w:w="3600"/>
-          </w:tcPr>
-          <w:p>
+        <w:trPr>
+          <w:cantSplit/>
+        </w:trPr>
+        <w:tc>
+          <w:tcPr>
+            <w:tcW w:type="dxa" w:w="3312"/>
+          </w:tcPr>
+          <w:p>
+            <w:pPr>
+              <w:spacing w:after="40"/>
+            </w:pPr>
             <w:r>
               <w:rPr>
                 <w:b/>
+                <w:i w:val="0"/>
                 <w:color w:val="152130"/>
                 <w:sz w:val="20"/>
               </w:rPr>
@@ -2308,12 +2382,16 @@
         </w:tc>
         <w:tc>
           <w:tcPr>
-            <w:tcW w:type="dxa" w:w="5760"/>
-          </w:tcPr>
-          <w:p>
+            <w:tcW w:type="dxa" w:w="6480"/>
+          </w:tcPr>
+          <w:p>
+            <w:pPr>
+              <w:spacing w:after="40"/>
+            </w:pPr>
             <w:r>
               <w:rPr>
                 <w:b w:val="0"/>
+                <w:i w:val="0"/>
                 <w:sz w:val="19"/>
               </w:rPr>
               <w:t>Operating profit grew across the book — Röko EBITA +5% (SEK 415m), Tempest operating result up (sales +11%), TBK EBIT JPY 1.50bn (from 0.94bn).</w:t>
@@ -2322,14 +2400,21 @@
         </w:tc>
       </w:tr>
       <w:tr>
-        <w:tc>
-          <w:tcPr>
-            <w:tcW w:type="dxa" w:w="3600"/>
-          </w:tcPr>
-          <w:p>
+        <w:trPr>
+          <w:cantSplit/>
+        </w:trPr>
+        <w:tc>
+          <w:tcPr>
+            <w:tcW w:type="dxa" w:w="3312"/>
+          </w:tcPr>
+          <w:p>
+            <w:pPr>
+              <w:spacing w:after="40"/>
+            </w:pPr>
             <w:r>
               <w:rPr>
                 <w:b/>
+                <w:i w:val="0"/>
                 <w:color w:val="152130"/>
                 <w:sz w:val="20"/>
               </w:rPr>
@@ -2339,12 +2424,16 @@
         </w:tc>
         <w:tc>
           <w:tcPr>
-            <w:tcW w:type="dxa" w:w="5760"/>
-          </w:tcPr>
-          <w:p>
+            <w:tcW w:type="dxa" w:w="6480"/>
+          </w:tcPr>
+          <w:p>
+            <w:pPr>
+              <w:spacing w:after="40"/>
+            </w:pPr>
             <w:r>
               <w:rPr>
                 <w:b w:val="0"/>
+                <w:i w:val="0"/>
                 <w:sz w:val="19"/>
               </w:rPr>
               <w:t>17 positions, the ten largest ~84% of NAV; no new platform forced in a quarter we judged expensive.</w:t>
@@ -2354,10 +2443,14 @@
       </w:tr>
     </w:tbl>
     <w:p>
+      <w:pPr>
+        <w:keepNext/>
+      </w:pPr>
       <w:r>
         <w:rPr>
           <w:rFonts w:ascii="Times New Roman" w:hAnsi="Times New Roman"/>
           <w:b/>
+          <w:i w:val="0"/>
           <w:color w:val="152130"/>
           <w:sz w:val="24"/>
         </w:rPr>
@@ -2370,20 +2463,30 @@
         <w:tblW w:type="auto" w:w="0"/>
         <w:tblLayout w:type="fixed"/>
         <w:tblLook w:firstColumn="1" w:firstRow="1" w:lastColumn="0" w:lastRow="0" w:noHBand="0" w:noVBand="1" w:val="04A0"/>
+        <w:tblLayout w:type="fixed"/>
+        <w:tblW w:type="dxa" w:w="9792"/>
       </w:tblPr>
       <w:tblGrid>
-        <w:gridCol w:w="3600"/>
-        <w:gridCol w:w="5760"/>
+        <w:gridCol w:w="3312"/>
+        <w:gridCol w:w="6480"/>
       </w:tblGrid>
       <w:tr>
-        <w:tc>
-          <w:tcPr>
-            <w:tcW w:type="dxa" w:w="3600"/>
-          </w:tcPr>
-          <w:p>
+        <w:trPr>
+          <w:cantSplit/>
+          <w:tblHeader/>
+        </w:trPr>
+        <w:tc>
+          <w:tcPr>
+            <w:tcW w:type="dxa" w:w="3312"/>
+          </w:tcPr>
+          <w:p>
+            <w:pPr>
+              <w:spacing w:after="40"/>
+            </w:pPr>
             <w:r>
               <w:rPr>
                 <w:b/>
+                <w:i w:val="0"/>
                 <w:color w:val="314359"/>
                 <w:sz w:val="18"/>
               </w:rPr>
@@ -2393,12 +2496,16 @@
         </w:tc>
         <w:tc>
           <w:tcPr>
-            <w:tcW w:type="dxa" w:w="5760"/>
-          </w:tcPr>
-          <w:p>
+            <w:tcW w:type="dxa" w:w="6480"/>
+          </w:tcPr>
+          <w:p>
+            <w:pPr>
+              <w:spacing w:after="40"/>
+            </w:pPr>
             <w:r>
               <w:rPr>
                 <w:b/>
+                <w:i w:val="0"/>
                 <w:color w:val="314359"/>
                 <w:sz w:val="18"/>
               </w:rPr>
@@ -2408,14 +2515,21 @@
         </w:tc>
       </w:tr>
       <w:tr>
-        <w:tc>
-          <w:tcPr>
-            <w:tcW w:type="dxa" w:w="3600"/>
-          </w:tcPr>
-          <w:p>
+        <w:trPr>
+          <w:cantSplit/>
+        </w:trPr>
+        <w:tc>
+          <w:tcPr>
+            <w:tcW w:type="dxa" w:w="3312"/>
+          </w:tcPr>
+          <w:p>
+            <w:pPr>
+              <w:spacing w:after="40"/>
+            </w:pPr>
             <w:r>
               <w:rPr>
                 <w:b/>
+                <w:i w:val="0"/>
                 <w:color w:val="152130"/>
                 <w:sz w:val="20"/>
               </w:rPr>
@@ -2425,12 +2539,16 @@
         </w:tc>
         <w:tc>
           <w:tcPr>
-            <w:tcW w:type="dxa" w:w="5760"/>
-          </w:tcPr>
-          <w:p>
+            <w:tcW w:type="dxa" w:w="6480"/>
+          </w:tcPr>
+          <w:p>
+            <w:pPr>
+              <w:spacing w:after="40"/>
+            </w:pPr>
             <w:r>
               <w:rPr>
                 <w:b w:val="0"/>
+                <w:i w:val="0"/>
                 <w:sz w:val="19"/>
               </w:rPr>
               <w:t>Gross exposure 85.3% = net exposure 85.3% — zero fund-level leverage, with ~6.9% cash.</w:t>
@@ -2439,14 +2557,21 @@
         </w:tc>
       </w:tr>
       <w:tr>
-        <w:tc>
-          <w:tcPr>
-            <w:tcW w:type="dxa" w:w="3600"/>
-          </w:tcPr>
-          <w:p>
+        <w:trPr>
+          <w:cantSplit/>
+        </w:trPr>
+        <w:tc>
+          <w:tcPr>
+            <w:tcW w:type="dxa" w:w="3312"/>
+          </w:tcPr>
+          <w:p>
+            <w:pPr>
+              <w:spacing w:after="40"/>
+            </w:pPr>
             <w:r>
               <w:rPr>
                 <w:b/>
+                <w:i w:val="0"/>
                 <w:color w:val="152130"/>
                 <w:sz w:val="20"/>
               </w:rPr>
@@ -2456,12 +2581,16 @@
         </w:tc>
         <w:tc>
           <w:tcPr>
-            <w:tcW w:type="dxa" w:w="5760"/>
-          </w:tcPr>
-          <w:p>
+            <w:tcW w:type="dxa" w:w="6480"/>
+          </w:tcPr>
+          <w:p>
+            <w:pPr>
+              <w:spacing w:after="40"/>
+            </w:pPr>
             <w:r>
               <w:rPr>
                 <w:b w:val="0"/>
+                <w:i w:val="0"/>
                 <w:sz w:val="19"/>
               </w:rPr>
               <w:t>17 positions; downside risk 8.7%, 1-day 95% VaR 1.5%; a full liquidity profile disclosed (22.5% of NAV within one day).</w:t>
@@ -2470,14 +2599,21 @@
         </w:tc>
       </w:tr>
       <w:tr>
-        <w:tc>
-          <w:tcPr>
-            <w:tcW w:type="dxa" w:w="3600"/>
-          </w:tcPr>
-          <w:p>
+        <w:trPr>
+          <w:cantSplit/>
+        </w:trPr>
+        <w:tc>
+          <w:tcPr>
+            <w:tcW w:type="dxa" w:w="3312"/>
+          </w:tcPr>
+          <w:p>
+            <w:pPr>
+              <w:spacing w:after="40"/>
+            </w:pPr>
             <w:r>
               <w:rPr>
                 <w:b/>
+                <w:i w:val="0"/>
                 <w:color w:val="152130"/>
                 <w:sz w:val="20"/>
               </w:rPr>
@@ -2487,12 +2623,16 @@
         </w:tc>
         <w:tc>
           <w:tcPr>
-            <w:tcW w:type="dxa" w:w="5760"/>
-          </w:tcPr>
-          <w:p>
+            <w:tcW w:type="dxa" w:w="6480"/>
+          </w:tcPr>
+          <w:p>
+            <w:pPr>
+              <w:spacing w:after="40"/>
+            </w:pPr>
             <w:r>
               <w:rPr>
                 <w:b w:val="0"/>
+                <w:i w:val="0"/>
                 <w:sz w:val="19"/>
               </w:rPr>
               <w:t>Spread across Nordic, UK and Japanese listings and across software, industrials, gaming, media and resources.</w:t>
@@ -2501,14 +2641,21 @@
         </w:tc>
       </w:tr>
       <w:tr>
-        <w:tc>
-          <w:tcPr>
-            <w:tcW w:type="dxa" w:w="3600"/>
-          </w:tcPr>
-          <w:p>
+        <w:trPr>
+          <w:cantSplit/>
+        </w:trPr>
+        <w:tc>
+          <w:tcPr>
+            <w:tcW w:type="dxa" w:w="3312"/>
+          </w:tcPr>
+          <w:p>
+            <w:pPr>
+              <w:spacing w:after="40"/>
+            </w:pPr>
             <w:r>
               <w:rPr>
                 <w:b/>
+                <w:i w:val="0"/>
                 <w:color w:val="152130"/>
                 <w:sz w:val="20"/>
               </w:rPr>
@@ -2518,12 +2665,16 @@
         </w:tc>
         <w:tc>
           <w:tcPr>
-            <w:tcW w:type="dxa" w:w="5760"/>
-          </w:tcPr>
-          <w:p>
+            <w:tcW w:type="dxa" w:w="6480"/>
+          </w:tcPr>
+          <w:p>
+            <w:pPr>
+              <w:spacing w:after="40"/>
+            </w:pPr>
             <w:r>
               <w:rPr>
                 <w:b w:val="0"/>
+                <w:i w:val="0"/>
                 <w:sz w:val="19"/>
               </w:rPr>
               <w:t>Acted on the Zalaris fair-value trigger; held cash rather than relax the valuation bar in a market we find expensive.</w:t>
@@ -2532,14 +2683,21 @@
         </w:tc>
       </w:tr>
       <w:tr>
-        <w:tc>
-          <w:tcPr>
-            <w:tcW w:type="dxa" w:w="3600"/>
-          </w:tcPr>
-          <w:p>
+        <w:trPr>
+          <w:cantSplit/>
+        </w:trPr>
+        <w:tc>
+          <w:tcPr>
+            <w:tcW w:type="dxa" w:w="3312"/>
+          </w:tcPr>
+          <w:p>
+            <w:pPr>
+              <w:spacing w:after="40"/>
+            </w:pPr>
             <w:r>
               <w:rPr>
                 <w:b/>
+                <w:i w:val="0"/>
                 <w:color w:val="152130"/>
                 <w:sz w:val="20"/>
               </w:rPr>
@@ -2549,12 +2707,16 @@
         </w:tc>
         <w:tc>
           <w:tcPr>
-            <w:tcW w:type="dxa" w:w="5760"/>
-          </w:tcPr>
-          <w:p>
+            <w:tcW w:type="dxa" w:w="6480"/>
+          </w:tcPr>
+          <w:p>
+            <w:pPr>
+              <w:spacing w:after="40"/>
+            </w:pPr>
             <w:r>
               <w:rPr>
                 <w:b w:val="0"/>
+                <w:i w:val="0"/>
                 <w:sz w:val="19"/>
               </w:rPr>
               <w:t>Concentrated in durable market leaders; speculative exposure is limited and disclosed (e.g. NGEx held as exploration optionality).</w:t>
@@ -2563,14 +2725,21 @@
         </w:tc>
       </w:tr>
       <w:tr>
-        <w:tc>
-          <w:tcPr>
-            <w:tcW w:type="dxa" w:w="3600"/>
-          </w:tcPr>
-          <w:p>
+        <w:trPr>
+          <w:cantSplit/>
+        </w:trPr>
+        <w:tc>
+          <w:tcPr>
+            <w:tcW w:type="dxa" w:w="3312"/>
+          </w:tcPr>
+          <w:p>
+            <w:pPr>
+              <w:spacing w:after="40"/>
+            </w:pPr>
             <w:r>
               <w:rPr>
                 <w:b/>
+                <w:i w:val="0"/>
                 <w:color w:val="152130"/>
                 <w:sz w:val="20"/>
               </w:rPr>
@@ -2580,12 +2749,16 @@
         </w:tc>
         <w:tc>
           <w:tcPr>
-            <w:tcW w:type="dxa" w:w="5760"/>
-          </w:tcPr>
-          <w:p>
+            <w:tcW w:type="dxa" w:w="6480"/>
+          </w:tcPr>
+          <w:p>
+            <w:pPr>
+              <w:spacing w:after="40"/>
+            </w:pPr>
             <w:r>
               <w:rPr>
                 <w:b w:val="0"/>
+                <w:i w:val="0"/>
                 <w:sz w:val="19"/>
               </w:rPr>
               <w:t>Performance sourced from StatPro; figures reconciled, with open items (liquidity placeholders, unit flags) listed explicitly for verification.</w:t>

</xml_diff>

<commit_message>
Q1 report v5: remove misattributed Lex Asea spin-off from Tempest write-up
Tempest has not done any spin-off; delete the incorrect first paragraph of its
'Our view' (Lex Asea subsidiary distribution / buyback-redemption), leaving the
accurate business-rationale paragraph. Only remaining Lex Asea reference is the
correct Athanase Innovation one in the process table.

https://claude.ai/code/session_01HQUpw4QYvApiNnSfGrjnJ2
</commit_message>
<xml_diff>
--- a/Athanase_AIP_FII_Q1_2026_v5.docx
+++ b/Athanase_AIP_FII_Q1_2026_v5.docx
@@ -9404,20 +9404,6 @@
           <w:sz w:val="20"/>
         </w:rPr>
         <w:t>Our view</w:t>
-      </w:r>
-    </w:p>
-    <w:p>
-      <w:pPr>
-        <w:spacing w:before="40" w:after="60" w:line="269" w:lineRule="auto"/>
-        <w:jc w:val="left"/>
-      </w:pPr>
-      <w:r>
-        <w:rPr>
-          <w:b w:val="0"/>
-          <w:i w:val="0"/>
-          <w:sz w:val="21"/>
-        </w:rPr>
-        <w:t>The board is investigating the conditions for a future corporate structure, and part of this investigation concerns the possibility of distributing subsidiaries tax-free via Lex Asea. The company will obtain the Swedish Tax Agency’s position on whether such a distribution is possible. After the spin-off, the board will evaluate the use of the cash, which could be distributed through a further share-buyback programme or a redemption.</w:t>
       </w:r>
     </w:p>
     <w:p>

</xml_diff>

<commit_message>
Q1 report v5: clean pagination — one holding per page, no split tables
Add page breaks before each portfolio holding and the major sections (portfolio
holdings, monthly returns, notes), so each holding is self-contained on its own
page (p5 Tempest through p14 Rightmove). Add cantSplit to every table row so no
table breaks across a page boundary, and keep-with-next on holding sub-headings
(company description, our view, recent events, financials, chart) so headings
never strand at a page foot. Resolves table/text overflow.

https://claude.ai/code/session_01HQUpw4QYvApiNnSfGrjnJ2
</commit_message>
<xml_diff>
--- a/Athanase_AIP_FII_Q1_2026_v5.docx
+++ b/Athanase_AIP_FII_Q1_2026_v5.docx
@@ -799,6 +799,9 @@
         <w:gridCol w:w="4968"/>
       </w:tblGrid>
       <w:tr>
+        <w:trPr>
+          <w:cantSplit/>
+        </w:trPr>
         <w:tc>
           <w:tcPr>
             <w:tcW w:type="dxa" w:w="4968"/>
@@ -2781,6 +2784,7 @@
     <w:p>
       <w:pPr>
         <w:keepNext/>
+        <w:pageBreakBefore/>
         <w:spacing w:before="240" w:after="80"/>
       </w:pPr>
       <w:r>
@@ -9065,6 +9069,7 @@
     <w:p>
       <w:pPr>
         <w:keepNext/>
+        <w:pageBreakBefore/>
         <w:spacing w:before="360" w:after="80"/>
       </w:pPr>
       <w:r>
@@ -9555,6 +9560,7 @@
       <w:pPr>
         <w:keepNext/>
         <w:spacing w:before="120" w:after="80"/>
+        <w:pageBreakBefore/>
         <w:pBdr>
           <w:bottom w:val="single" w:sz="6" w:space="2" w:color="314359"/>
         </w:pBdr>
@@ -10653,6 +10659,7 @@
       <w:pPr>
         <w:keepNext/>
         <w:spacing w:before="120" w:after="80"/>
+        <w:pageBreakBefore/>
         <w:pBdr>
           <w:bottom w:val="single" w:sz="6" w:space="2" w:color="314359"/>
         </w:pBdr>
@@ -10822,6 +10829,7 @@
       <w:pPr>
         <w:keepNext/>
         <w:spacing w:before="120" w:after="80"/>
+        <w:pageBreakBefore/>
         <w:pBdr>
           <w:bottom w:val="single" w:sz="6" w:space="2" w:color="314359"/>
         </w:pBdr>
@@ -12012,6 +12020,7 @@
       <w:pPr>
         <w:keepNext/>
         <w:spacing w:before="120" w:after="80"/>
+        <w:pageBreakBefore/>
         <w:pBdr>
           <w:bottom w:val="single" w:sz="6" w:space="2" w:color="314359"/>
         </w:pBdr>
@@ -13122,6 +13131,7 @@
       <w:pPr>
         <w:keepNext/>
         <w:spacing w:before="120" w:after="80"/>
+        <w:pageBreakBefore/>
         <w:pBdr>
           <w:bottom w:val="single" w:sz="6" w:space="2" w:color="314359"/>
         </w:pBdr>
@@ -13622,6 +13632,7 @@
       <w:pPr>
         <w:keepNext/>
         <w:spacing w:before="120" w:after="80"/>
+        <w:pageBreakBefore/>
         <w:pBdr>
           <w:bottom w:val="single" w:sz="6" w:space="2" w:color="314359"/>
         </w:pBdr>
@@ -14717,6 +14728,7 @@
       <w:pPr>
         <w:keepNext/>
         <w:spacing w:before="120" w:after="80"/>
+        <w:pageBreakBefore/>
         <w:pBdr>
           <w:bottom w:val="single" w:sz="6" w:space="2" w:color="314359"/>
         </w:pBdr>
@@ -15191,6 +15203,7 @@
       <w:pPr>
         <w:keepNext/>
         <w:spacing w:before="120" w:after="80"/>
+        <w:pageBreakBefore/>
         <w:pBdr>
           <w:bottom w:val="single" w:sz="6" w:space="2" w:color="314359"/>
         </w:pBdr>
@@ -16274,6 +16287,7 @@
       <w:pPr>
         <w:keepNext/>
         <w:spacing w:before="120" w:after="80"/>
+        <w:pageBreakBefore/>
         <w:pBdr>
           <w:bottom w:val="single" w:sz="6" w:space="2" w:color="314359"/>
         </w:pBdr>
@@ -17452,6 +17466,7 @@
       <w:pPr>
         <w:keepNext/>
         <w:spacing w:before="360" w:after="80"/>
+        <w:pageBreakBefore/>
         <w:pBdr>
           <w:bottom w:val="single" w:sz="6" w:space="2" w:color="314359"/>
         </w:pBdr>

</xml_diff>

<commit_message>
Q1 report v5: remove 'Notes & items to verify' section
Delete the internal 'Notes & items to verify' section (heading + intro + bullets)
from the end of the letter, and trim the now-dangling 'items flagged ... at the
end' clause from the preamble. Document now ends on Rightmove (14 pages).

https://claude.ai/code/session_01HQUpw4QYvApiNnSfGrjnJ2
</commit_message>
<xml_diff>
--- a/Athanase_AIP_FII_Q1_2026_v5.docx
+++ b/Athanase_AIP_FII_Q1_2026_v5.docx
@@ -56,7 +56,7 @@
           <w:color w:val="556A83"/>
           <w:sz w:val="18"/>
         </w:rPr>
-        <w:t>Reconstructed, editorially corrected Word version of the original Publisher report. Narrative text reflects the grammar, spelling and academic-rigour corrections; figures and tables are reproduced from the source. Items flagged for verification are listed at the end.</w:t>
+        <w:t>Reconstructed, editorially corrected Word version of the original Publisher report. Narrative text reflects the grammar, spelling and academic-rigour corrections; figures and tables are reproduced from the source.</w:t>
       </w:r>
     </w:p>
     <w:p>
@@ -17460,111 +17460,6 @@
       </w:pPr>
       <w:r>
         <w:br w:type="page"/>
-      </w:r>
-    </w:p>
-    <w:p>
-      <w:pPr>
-        <w:keepNext/>
-        <w:spacing w:before="360" w:after="80"/>
-        <w:pageBreakBefore/>
-        <w:pBdr>
-          <w:bottom w:val="single" w:sz="6" w:space="2" w:color="314359"/>
-        </w:pBdr>
-      </w:pPr>
-      <w:r>
-        <w:rPr>
-          <w:rFonts w:ascii="Times New Roman" w:hAnsi="Times New Roman"/>
-          <w:b/>
-          <w:color w:val="152130"/>
-          <w:sz w:val="30"/>
-        </w:rPr>
-        <w:t>Notes &amp; items to verify</w:t>
-      </w:r>
-    </w:p>
-    <w:p>
-      <w:pPr>
-        <w:spacing w:before="40" w:after="80" w:line="269" w:lineRule="auto"/>
-        <w:jc w:val="left"/>
-      </w:pPr>
-      <w:r>
-        <w:rPr>
-          <w:b w:val="0"/>
-          <w:i w:val="0"/>
-          <w:sz w:val="21"/>
-        </w:rPr>
-        <w:t>The following are not language issues; figures are reproduced as printed and should be checked against source data:</w:t>
-      </w:r>
-    </w:p>
-    <w:p>
-      <w:pPr>
-        <w:pStyle w:val="ListBullet"/>
-        <w:spacing w:after="20"/>
-      </w:pPr>
-      <w:r>
-        <w:rPr>
-          <w:sz w:val="21"/>
-        </w:rPr>
-        <w:t>Unfilled placeholders in the liquidity section: “XX%” liquidation share and haircut, and “Within redemption period: X%”.</w:t>
-      </w:r>
-    </w:p>
-    <w:p>
-      <w:pPr>
-        <w:pStyle w:val="ListBullet"/>
-        <w:spacing w:after="20"/>
-      </w:pPr>
-      <w:r>
-        <w:rPr>
-          <w:sz w:val="21"/>
-        </w:rPr>
-        <w:t>Template/placeholder residue in the source: a repeated facts block (SEK 104m mcap, SEK 95m EV, 20% ownership, “Since 2019”) and a Net Revenue series 300/340/424/469/486/276 appear beside more than one holding (and do not match them). These residual tables have been omitted rather than misattributed. A separate 108/106 MSEK block with a 340/424/469/486/582/132 series is similarly inconsistent.</w:t>
-      </w:r>
-    </w:p>
-    <w:p>
-      <w:pPr>
-        <w:pStyle w:val="ListBullet"/>
-        <w:spacing w:after="20"/>
-      </w:pPr>
-      <w:r>
-        <w:rPr>
-          <w:sz w:val="21"/>
-        </w:rPr>
-        <w:t>TBK market cap/EV are labelled “BN JPY” in the source, which is inconsistent with ¥55bn revenue — most likely a unit error; reproduced as printed.</w:t>
-      </w:r>
-    </w:p>
-    <w:p>
-      <w:pPr>
-        <w:pStyle w:val="ListBullet"/>
-        <w:spacing w:after="20"/>
-      </w:pPr>
-      <w:r>
-        <w:rPr>
-          <w:sz w:val="21"/>
-        </w:rPr>
-        <w:t>Norvestor offer for Zalaris: “NOK 100” assumed to be per share.</w:t>
-      </w:r>
-    </w:p>
-    <w:p>
-      <w:pPr>
-        <w:pStyle w:val="ListBullet"/>
-        <w:spacing w:after="20"/>
-      </w:pPr>
-      <w:r>
-        <w:rPr>
-          <w:sz w:val="21"/>
-        </w:rPr>
-        <w:t>Zutec, Evolution and NGEx had no self-consistent financial-results table in the source (narrative figures only), so only their key-facts boxes are shown.</w:t>
-      </w:r>
-    </w:p>
-    <w:p>
-      <w:pPr>
-        <w:pStyle w:val="ListBullet"/>
-        <w:spacing w:after="20"/>
-      </w:pPr>
-      <w:r>
-        <w:rPr>
-          <w:sz w:val="21"/>
-        </w:rPr>
-        <w:t>The monthly-returns grid was auto-extracted; the values are taken directly from the source, but the trailing (unreported) 2026 cells may be misaligned by one column and should be checked.</w:t>
       </w:r>
     </w:p>
     <w:sectPr>

</xml_diff>